<commit_message>
Remove meta note from seminar paper download
</commit_message>
<xml_diff>
--- a/downloads/Seminararbeit_Teil_Modell_und_Messreihen_aktualisiert.docx
+++ b/downloads/Seminararbeit_Teil_Modell_und_Messreihen_aktualisiert.docx
@@ -113,11 +113,6 @@
     <w:p>
       <w:r>
         <w:t>Für die Auswertung werden mehrere Steuerungen verglichen. Es gibt eine naive Steuerung, eine regelbasierte Steuerung, Claude-Live-Läufe und Codex-Operator-Läufe. Die Claude- und Codex-Läufe sind keine eingebauten Kraftwerksmodelle, sondern Bediener des Simulators. Sie lesen den Netzzustand und entscheiden dann, welche Leistung Speicher, Wasserstoff-Gasturbine, Elektrolyseur oder andere flexible Komponenten bekommen sollen.</w:t>
-      </w:r>
-    </w:p>
-    <w:p>
-      <w:r>
-        <w:t>Dieser Text ist bewusst einfacher geschrieben als eine technische Veröffentlichung. Er soll zeigen, wie das Modell funktioniert, warum bestimmte Messgrößen wichtig sind und was man aus den Ergebnissen lernen kann. Formeln werden nur dort benutzt, wo sie wirklich helfen. Die genaue Implementierung steht im Programmcode, die physikalische Idee wird hier in Worten erklärt.</w:t>
       </w:r>
     </w:p>
     <w:p>

</xml_diff>